<commit_message>
Creation of views and controller
</commit_message>
<xml_diff>
--- a/logique de code.docx
+++ b/logique de code.docx
@@ -8,10 +8,947 @@
           <w:lang w:val="fr-FR"/>
         </w:rPr>
       </w:pPr>
-      <w:r>
-        <w:rPr>
-          <w:lang w:val="fr-FR"/>
-        </w:rPr>
+      <w:proofErr w:type="spellStart"/>
+      <w:r>
+        <w:rPr>
+          <w:lang w:val="fr-FR"/>
+        </w:rPr>
+        <w:t>MainMenu</w:t>
+      </w:r>
+      <w:proofErr w:type="spellEnd"/>
+    </w:p>
+    <w:p>
+      <w:pPr>
+        <w:pStyle w:val="Paragraphedeliste"/>
+        <w:rPr>
+          <w:b/>
+          <w:bCs/>
+          <w:lang w:val="fr-FR"/>
+        </w:rPr>
+      </w:pPr>
+      <w:r>
+        <w:rPr>
+          <w:b/>
+          <w:bCs/>
+          <w:lang w:val="fr-FR"/>
+        </w:rPr>
+        <w:t>Boutons</w:t>
+      </w:r>
+    </w:p>
+    <w:p>
+      <w:pPr>
+        <w:pStyle w:val="Paragraphedeliste"/>
+        <w:pBdr>
+          <w:top w:val="single" w:sz="4" w:space="1" w:color="auto"/>
+          <w:left w:val="single" w:sz="4" w:space="4" w:color="auto"/>
+          <w:bottom w:val="single" w:sz="4" w:space="1" w:color="auto"/>
+          <w:right w:val="single" w:sz="4" w:space="4" w:color="auto"/>
+        </w:pBdr>
+        <w:ind w:left="1080"/>
+        <w:rPr>
+          <w:lang w:val="fr-FR"/>
+        </w:rPr>
+      </w:pPr>
+      <w:proofErr w:type="spellStart"/>
+      <w:r>
+        <w:rPr>
+          <w:b/>
+          <w:bCs/>
+          <w:highlight w:val="green"/>
+          <w:lang w:val="fr-FR"/>
+        </w:rPr>
+        <w:t>Btn</w:t>
+      </w:r>
+      <w:proofErr w:type="spellEnd"/>
+      <w:r>
+        <w:rPr>
+          <w:highlight w:val="green"/>
+          <w:lang w:val="fr-FR"/>
+        </w:rPr>
+        <w:t>-</w:t>
+      </w:r>
+      <w:r>
+        <w:rPr>
+          <w:highlight w:val="green"/>
+          <w:lang w:val="fr-FR"/>
+        </w:rPr>
+        <w:t>Nouveau Client</w:t>
+      </w:r>
+    </w:p>
+    <w:p>
+      <w:pPr>
+        <w:pStyle w:val="Paragraphedeliste"/>
+        <w:numPr>
+          <w:ilvl w:val="1"/>
+          <w:numId w:val="5"/>
+        </w:numPr>
+        <w:rPr>
+          <w:color w:val="0F9ED5" w:themeColor="accent4"/>
+          <w:lang w:val="fr-FR"/>
+        </w:rPr>
+      </w:pPr>
+      <w:proofErr w:type="spellStart"/>
+      <w:r>
+        <w:rPr>
+          <w:color w:val="0F9ED5" w:themeColor="accent4"/>
+          <w:lang w:val="fr-FR"/>
+        </w:rPr>
+        <w:t>NewClientForm</w:t>
+      </w:r>
+      <w:proofErr w:type="spellEnd"/>
+      <w:r>
+        <w:rPr>
+          <w:color w:val="0F9ED5" w:themeColor="accent4"/>
+          <w:lang w:val="fr-FR"/>
+        </w:rPr>
+        <w:t xml:space="preserve"> </w:t>
+      </w:r>
+      <w:r>
+        <w:rPr>
+          <w:i/>
+          <w:iCs/>
+          <w:color w:val="FFC000"/>
+          <w:sz w:val="20"/>
+          <w:szCs w:val="20"/>
+          <w:lang w:val="fr-FR"/>
+        </w:rPr>
+        <w:t xml:space="preserve">– erreur sur </w:t>
+      </w:r>
+      <w:proofErr w:type="spellStart"/>
+      <w:r>
+        <w:rPr>
+          <w:i/>
+          <w:iCs/>
+          <w:color w:val="FFC000"/>
+          <w:sz w:val="20"/>
+          <w:szCs w:val="20"/>
+          <w:lang w:val="fr-FR"/>
+        </w:rPr>
+        <w:t>ModelState.IsValid</w:t>
+      </w:r>
+      <w:proofErr w:type="spellEnd"/>
+      <w:r>
+        <w:rPr>
+          <w:i/>
+          <w:iCs/>
+          <w:color w:val="FFC000"/>
+          <w:sz w:val="20"/>
+          <w:szCs w:val="20"/>
+          <w:lang w:val="fr-FR"/>
+        </w:rPr>
+        <w:t xml:space="preserve"> comment voir ce qui bloque</w:t>
+      </w:r>
+    </w:p>
+    <w:p>
+      <w:pPr>
+        <w:pStyle w:val="Paragraphedeliste"/>
+        <w:numPr>
+          <w:ilvl w:val="2"/>
+          <w:numId w:val="5"/>
+        </w:numPr>
+        <w:rPr>
+          <w:color w:val="196B24" w:themeColor="accent3"/>
+          <w:lang w:val="fr-FR"/>
+        </w:rPr>
+      </w:pPr>
+      <w:r>
+        <w:rPr>
+          <w:color w:val="196B24" w:themeColor="accent3"/>
+          <w:lang w:val="fr-FR"/>
+        </w:rPr>
+        <w:t>Question</w:t>
+      </w:r>
+      <w:r>
+        <w:rPr>
+          <w:color w:val="196B24" w:themeColor="accent3"/>
+          <w:lang w:val="fr-FR"/>
+        </w:rPr>
+        <w:t xml:space="preserve"> </w:t>
+      </w:r>
+      <w:r>
+        <w:rPr>
+          <w:i/>
+          <w:iCs/>
+          <w:color w:val="FFC000"/>
+          <w:sz w:val="20"/>
+          <w:szCs w:val="20"/>
+          <w:lang w:val="fr-FR"/>
+        </w:rPr>
+        <w:t>– le formulaire va être complexe, il faut lier avec un choix de réponse oui/non avec la table répondre</w:t>
+      </w:r>
+    </w:p>
+    <w:p>
+      <w:pPr>
+        <w:pStyle w:val="Paragraphedeliste"/>
+        <w:numPr>
+          <w:ilvl w:val="3"/>
+          <w:numId w:val="5"/>
+        </w:numPr>
+        <w:rPr>
+          <w:color w:val="E97132" w:themeColor="accent2"/>
+          <w:lang w:val="fr-FR"/>
+        </w:rPr>
+      </w:pPr>
+      <w:r>
+        <w:rPr>
+          <w:color w:val="E97132" w:themeColor="accent2"/>
+          <w:lang w:val="fr-FR"/>
+        </w:rPr>
+        <w:t>Result</w:t>
+      </w:r>
+    </w:p>
+    <w:p>
+      <w:pPr>
+        <w:pStyle w:val="Paragraphedeliste"/>
+        <w:ind w:left="3240"/>
+        <w:rPr>
+          <w:lang w:val="fr-FR"/>
+        </w:rPr>
+      </w:pPr>
+    </w:p>
+    <w:p>
+      <w:pPr>
+        <w:pStyle w:val="Paragraphedeliste"/>
+        <w:pBdr>
+          <w:top w:val="single" w:sz="4" w:space="1" w:color="auto"/>
+          <w:left w:val="single" w:sz="4" w:space="4" w:color="auto"/>
+          <w:bottom w:val="single" w:sz="4" w:space="1" w:color="auto"/>
+          <w:right w:val="single" w:sz="4" w:space="4" w:color="auto"/>
+        </w:pBdr>
+        <w:ind w:left="1080"/>
+        <w:rPr>
+          <w:lang w:val="fr-FR"/>
+        </w:rPr>
+      </w:pPr>
+      <w:proofErr w:type="spellStart"/>
+      <w:r>
+        <w:rPr>
+          <w:b/>
+          <w:bCs/>
+          <w:highlight w:val="green"/>
+          <w:lang w:val="fr-FR"/>
+        </w:rPr>
+        <w:t>Btn</w:t>
+      </w:r>
+      <w:proofErr w:type="spellEnd"/>
+      <w:r>
+        <w:rPr>
+          <w:highlight w:val="green"/>
+          <w:lang w:val="fr-FR"/>
+        </w:rPr>
+        <w:t>-</w:t>
+      </w:r>
+      <w:r>
+        <w:rPr>
+          <w:highlight w:val="green"/>
+          <w:lang w:val="fr-FR"/>
+        </w:rPr>
+        <w:t>Client Existant</w:t>
+      </w:r>
+    </w:p>
+    <w:p>
+      <w:pPr>
+        <w:pStyle w:val="Paragraphedeliste"/>
+        <w:numPr>
+          <w:ilvl w:val="1"/>
+          <w:numId w:val="5"/>
+        </w:numPr>
+        <w:rPr>
+          <w:lang w:val="fr-FR"/>
+        </w:rPr>
+      </w:pPr>
+      <w:proofErr w:type="spellStart"/>
+      <w:r>
+        <w:rPr>
+          <w:color w:val="E59EDC" w:themeColor="accent5" w:themeTint="66"/>
+          <w:lang w:val="fr-FR"/>
+        </w:rPr>
+        <w:t>DisplayClientList</w:t>
+      </w:r>
+      <w:proofErr w:type="spellEnd"/>
+      <w:r>
+        <w:rPr>
+          <w:color w:val="A02B93" w:themeColor="accent5"/>
+          <w:lang w:val="fr-FR"/>
+        </w:rPr>
+        <w:t xml:space="preserve"> </w:t>
+      </w:r>
+      <w:r>
+        <w:rPr>
+          <w:lang w:val="fr-FR"/>
+        </w:rPr>
+        <w:t xml:space="preserve">(2 boutons </w:t>
+      </w:r>
+      <w:proofErr w:type="spellStart"/>
+      <w:r>
+        <w:rPr>
+          <w:lang w:val="fr-FR"/>
+        </w:rPr>
+        <w:t>inline</w:t>
+      </w:r>
+      <w:proofErr w:type="spellEnd"/>
+      <w:r>
+        <w:rPr>
+          <w:lang w:val="fr-FR"/>
+        </w:rPr>
+        <w:t xml:space="preserve"> « </w:t>
+      </w:r>
+      <w:proofErr w:type="spellStart"/>
+      <w:r>
+        <w:rPr>
+          <w:lang w:val="fr-FR"/>
+        </w:rPr>
+        <w:t>modify</w:t>
+      </w:r>
+      <w:proofErr w:type="spellEnd"/>
+      <w:r>
+        <w:rPr>
+          <w:lang w:val="fr-FR"/>
+        </w:rPr>
+        <w:t> » 1 bouton « </w:t>
+      </w:r>
+      <w:proofErr w:type="spellStart"/>
+      <w:r>
+        <w:rPr>
+          <w:lang w:val="fr-FR"/>
+        </w:rPr>
+        <w:t>consult</w:t>
+      </w:r>
+      <w:proofErr w:type="spellEnd"/>
+      <w:r>
+        <w:rPr>
+          <w:lang w:val="fr-FR"/>
+        </w:rPr>
+        <w:t> »)</w:t>
+      </w:r>
+    </w:p>
+    <w:p>
+      <w:pPr>
+        <w:pStyle w:val="Paragraphedeliste"/>
+        <w:pBdr>
+          <w:top w:val="single" w:sz="4" w:space="1" w:color="auto"/>
+          <w:left w:val="single" w:sz="4" w:space="4" w:color="auto"/>
+          <w:bottom w:val="single" w:sz="4" w:space="1" w:color="auto"/>
+          <w:right w:val="single" w:sz="4" w:space="0" w:color="auto"/>
+        </w:pBdr>
+        <w:ind w:left="2520"/>
+        <w:rPr>
+          <w:lang w:val="fr-FR"/>
+        </w:rPr>
+      </w:pPr>
+      <w:proofErr w:type="spellStart"/>
+      <w:r>
+        <w:rPr>
+          <w:b/>
+          <w:bCs/>
+          <w:lang w:val="fr-FR"/>
+        </w:rPr>
+        <w:t>Btn</w:t>
+      </w:r>
+      <w:proofErr w:type="spellEnd"/>
+      <w:r>
+        <w:rPr>
+          <w:lang w:val="fr-FR"/>
+        </w:rPr>
+        <w:t>-</w:t>
+      </w:r>
+      <w:r>
+        <w:rPr>
+          <w:lang w:val="fr-FR"/>
+        </w:rPr>
+        <w:t>Modifier client</w:t>
+      </w:r>
+    </w:p>
+    <w:p>
+      <w:pPr>
+        <w:pStyle w:val="Paragraphedeliste"/>
+        <w:numPr>
+          <w:ilvl w:val="3"/>
+          <w:numId w:val="5"/>
+        </w:numPr>
+        <w:rPr>
+          <w:lang w:val="fr-FR"/>
+        </w:rPr>
+      </w:pPr>
+      <w:proofErr w:type="spellStart"/>
+      <w:r>
+        <w:rPr>
+          <w:color w:val="0F9ED5" w:themeColor="accent4"/>
+          <w:lang w:val="fr-FR"/>
+        </w:rPr>
+        <w:t>NewClientForm</w:t>
+      </w:r>
+      <w:proofErr w:type="spellEnd"/>
+      <w:r>
+        <w:rPr>
+          <w:lang w:val="fr-FR"/>
+        </w:rPr>
+        <w:t xml:space="preserve"> (remplie)</w:t>
+      </w:r>
+    </w:p>
+    <w:p>
+      <w:pPr>
+        <w:pStyle w:val="Paragraphedeliste"/>
+        <w:pBdr>
+          <w:top w:val="single" w:sz="4" w:space="1" w:color="auto"/>
+          <w:left w:val="single" w:sz="4" w:space="4" w:color="auto"/>
+          <w:bottom w:val="single" w:sz="4" w:space="1" w:color="auto"/>
+          <w:right w:val="single" w:sz="4" w:space="4" w:color="auto"/>
+        </w:pBdr>
+        <w:ind w:left="2520"/>
+        <w:rPr>
+          <w:lang w:val="fr-FR"/>
+        </w:rPr>
+      </w:pPr>
+      <w:proofErr w:type="spellStart"/>
+      <w:r>
+        <w:rPr>
+          <w:b/>
+          <w:bCs/>
+          <w:lang w:val="fr-FR"/>
+        </w:rPr>
+        <w:t>Btn</w:t>
+      </w:r>
+      <w:proofErr w:type="spellEnd"/>
+      <w:r>
+        <w:rPr>
+          <w:lang w:val="fr-FR"/>
+        </w:rPr>
+        <w:t>-</w:t>
+      </w:r>
+      <w:r>
+        <w:rPr>
+          <w:lang w:val="fr-FR"/>
+        </w:rPr>
+        <w:t>Modifier Questions</w:t>
+      </w:r>
+    </w:p>
+    <w:p>
+      <w:pPr>
+        <w:pStyle w:val="Paragraphedeliste"/>
+        <w:numPr>
+          <w:ilvl w:val="3"/>
+          <w:numId w:val="5"/>
+        </w:numPr>
+        <w:rPr>
+          <w:color w:val="196B24" w:themeColor="accent3"/>
+          <w:lang w:val="fr-FR"/>
+        </w:rPr>
+      </w:pPr>
+      <w:r>
+        <w:rPr>
+          <w:color w:val="196B24" w:themeColor="accent3"/>
+          <w:lang w:val="fr-FR"/>
+        </w:rPr>
+        <w:t>Question</w:t>
+      </w:r>
+      <w:r>
+        <w:rPr>
+          <w:color w:val="196B24" w:themeColor="accent3"/>
+          <w:lang w:val="fr-FR"/>
+        </w:rPr>
+        <w:t xml:space="preserve"> </w:t>
+      </w:r>
+      <w:r>
+        <w:rPr>
+          <w:lang w:val="fr-FR"/>
+        </w:rPr>
+        <w:t>(remplie)</w:t>
+      </w:r>
+    </w:p>
+    <w:p>
+      <w:pPr>
+        <w:pStyle w:val="Paragraphedeliste"/>
+        <w:pBdr>
+          <w:top w:val="single" w:sz="4" w:space="1" w:color="auto"/>
+          <w:left w:val="single" w:sz="4" w:space="4" w:color="auto"/>
+          <w:bottom w:val="single" w:sz="4" w:space="1" w:color="auto"/>
+          <w:right w:val="single" w:sz="4" w:space="4" w:color="auto"/>
+        </w:pBdr>
+        <w:ind w:left="2520"/>
+        <w:rPr>
+          <w:lang w:val="fr-FR"/>
+        </w:rPr>
+      </w:pPr>
+      <w:proofErr w:type="spellStart"/>
+      <w:r>
+        <w:rPr>
+          <w:b/>
+          <w:bCs/>
+          <w:lang w:val="fr-FR"/>
+        </w:rPr>
+        <w:t>Btn</w:t>
+      </w:r>
+      <w:proofErr w:type="spellEnd"/>
+      <w:r>
+        <w:rPr>
+          <w:lang w:val="fr-FR"/>
+        </w:rPr>
+        <w:t>-</w:t>
+      </w:r>
+      <w:r>
+        <w:rPr>
+          <w:lang w:val="fr-FR"/>
+        </w:rPr>
+        <w:t>Voir Résultat</w:t>
+      </w:r>
+    </w:p>
+    <w:p>
+      <w:pPr>
+        <w:pStyle w:val="Paragraphedeliste"/>
+        <w:numPr>
+          <w:ilvl w:val="3"/>
+          <w:numId w:val="5"/>
+        </w:numPr>
+        <w:rPr>
+          <w:color w:val="E97132" w:themeColor="accent2"/>
+          <w:lang w:val="fr-FR"/>
+        </w:rPr>
+      </w:pPr>
+      <w:r>
+        <w:rPr>
+          <w:color w:val="E97132" w:themeColor="accent2"/>
+          <w:lang w:val="fr-FR"/>
+        </w:rPr>
+        <w:t>Result</w:t>
+      </w:r>
+      <w:r>
+        <w:rPr>
+          <w:color w:val="E97132" w:themeColor="accent2"/>
+          <w:lang w:val="fr-FR"/>
+        </w:rPr>
+        <w:t xml:space="preserve"> </w:t>
+      </w:r>
+      <w:r>
+        <w:rPr>
+          <w:lang w:val="fr-FR"/>
+        </w:rPr>
+        <w:t>(remplie)</w:t>
+      </w:r>
+    </w:p>
+    <w:p>
+      <w:pPr>
+        <w:pStyle w:val="Paragraphedeliste"/>
+        <w:pBdr>
+          <w:top w:val="single" w:sz="4" w:space="1" w:color="auto"/>
+          <w:left w:val="single" w:sz="4" w:space="4" w:color="auto"/>
+          <w:bottom w:val="single" w:sz="4" w:space="1" w:color="auto"/>
+          <w:right w:val="single" w:sz="4" w:space="4" w:color="auto"/>
+        </w:pBdr>
+        <w:ind w:left="1080"/>
+        <w:rPr>
+          <w:lang w:val="fr-FR"/>
+        </w:rPr>
+      </w:pPr>
+      <w:proofErr w:type="spellStart"/>
+      <w:r>
+        <w:rPr>
+          <w:b/>
+          <w:bCs/>
+          <w:highlight w:val="green"/>
+          <w:lang w:val="fr-FR"/>
+        </w:rPr>
+        <w:t>Btn</w:t>
+      </w:r>
+      <w:proofErr w:type="spellEnd"/>
+      <w:r>
+        <w:rPr>
+          <w:highlight w:val="green"/>
+          <w:lang w:val="fr-FR"/>
+        </w:rPr>
+        <w:t>-</w:t>
+      </w:r>
+      <w:r>
+        <w:rPr>
+          <w:highlight w:val="green"/>
+          <w:lang w:val="fr-FR"/>
+        </w:rPr>
+        <w:t>Secteurs d’Activités</w:t>
+      </w:r>
+    </w:p>
+    <w:p>
+      <w:pPr>
+        <w:pStyle w:val="Paragraphedeliste"/>
+        <w:numPr>
+          <w:ilvl w:val="1"/>
+          <w:numId w:val="5"/>
+        </w:numPr>
+        <w:rPr>
+          <w:highlight w:val="green"/>
+          <w:lang w:val="fr-FR"/>
+        </w:rPr>
+      </w:pPr>
+      <w:proofErr w:type="spellStart"/>
+      <w:r>
+        <w:rPr>
+          <w:color w:val="C00000"/>
+          <w:highlight w:val="green"/>
+          <w:lang w:val="fr-FR"/>
+        </w:rPr>
+        <w:t>SecteurActiviteList</w:t>
+      </w:r>
+      <w:proofErr w:type="spellEnd"/>
+      <w:r>
+        <w:rPr>
+          <w:highlight w:val="green"/>
+          <w:lang w:val="fr-FR"/>
+        </w:rPr>
+        <w:t xml:space="preserve"> (bouton Nouveau)</w:t>
+      </w:r>
+    </w:p>
+    <w:p>
+      <w:pPr>
+        <w:pStyle w:val="Paragraphedeliste"/>
+        <w:numPr>
+          <w:ilvl w:val="2"/>
+          <w:numId w:val="5"/>
+        </w:numPr>
+        <w:rPr>
+          <w:color w:val="8DD873" w:themeColor="accent6" w:themeTint="99"/>
+          <w:lang w:val="fr-FR"/>
+        </w:rPr>
+      </w:pPr>
+      <w:proofErr w:type="spellStart"/>
+      <w:r>
+        <w:rPr>
+          <w:color w:val="8DD873" w:themeColor="accent6" w:themeTint="99"/>
+          <w:lang w:val="fr-FR"/>
+        </w:rPr>
+        <w:t>NewSecteurActivite</w:t>
+      </w:r>
+      <w:r>
+        <w:rPr>
+          <w:color w:val="8DD873" w:themeColor="accent6" w:themeTint="99"/>
+          <w:lang w:val="fr-FR"/>
+        </w:rPr>
+        <w:t>Form</w:t>
+      </w:r>
+      <w:proofErr w:type="spellEnd"/>
+    </w:p>
+    <w:p>
+      <w:pPr>
+        <w:pStyle w:val="Paragraphedeliste"/>
+        <w:pBdr>
+          <w:top w:val="single" w:sz="4" w:space="1" w:color="auto"/>
+          <w:left w:val="single" w:sz="4" w:space="4" w:color="auto"/>
+          <w:bottom w:val="single" w:sz="4" w:space="1" w:color="auto"/>
+          <w:right w:val="single" w:sz="4" w:space="4" w:color="auto"/>
+        </w:pBdr>
+        <w:ind w:left="2520"/>
+        <w:rPr>
+          <w:lang w:val="fr-FR"/>
+        </w:rPr>
+      </w:pPr>
+      <w:proofErr w:type="spellStart"/>
+      <w:r>
+        <w:rPr>
+          <w:b/>
+          <w:bCs/>
+          <w:highlight w:val="green"/>
+          <w:lang w:val="fr-FR"/>
+        </w:rPr>
+        <w:t>Btn</w:t>
+      </w:r>
+      <w:proofErr w:type="spellEnd"/>
+      <w:r>
+        <w:rPr>
+          <w:highlight w:val="green"/>
+          <w:lang w:val="fr-FR"/>
+        </w:rPr>
+        <w:t>-Nouveau</w:t>
+      </w:r>
+    </w:p>
+    <w:p>
+      <w:pPr>
+        <w:pStyle w:val="Paragraphedeliste"/>
+        <w:numPr>
+          <w:ilvl w:val="3"/>
+          <w:numId w:val="5"/>
+        </w:numPr>
+        <w:rPr>
+          <w:lang w:val="fr-FR"/>
+        </w:rPr>
+      </w:pPr>
+      <w:r>
+        <w:rPr>
+          <w:lang w:val="fr-FR"/>
+        </w:rPr>
+        <w:t>Id, Nom, Description (</w:t>
+      </w:r>
+      <w:proofErr w:type="spellStart"/>
+      <w:r>
+        <w:rPr>
+          <w:lang w:val="fr-FR"/>
+        </w:rPr>
+        <w:t>ApplicationOdoo</w:t>
+      </w:r>
+      <w:proofErr w:type="spellEnd"/>
+      <w:r>
+        <w:rPr>
+          <w:lang w:val="fr-FR"/>
+        </w:rPr>
+        <w:t>, Questions)</w:t>
+      </w:r>
+    </w:p>
+    <w:p>
+      <w:pPr>
+        <w:pStyle w:val="Paragraphedeliste"/>
+        <w:pBdr>
+          <w:top w:val="single" w:sz="4" w:space="1" w:color="auto"/>
+          <w:left w:val="single" w:sz="4" w:space="4" w:color="auto"/>
+          <w:bottom w:val="single" w:sz="4" w:space="1" w:color="auto"/>
+          <w:right w:val="single" w:sz="4" w:space="4" w:color="auto"/>
+        </w:pBdr>
+        <w:ind w:left="1080"/>
+        <w:rPr>
+          <w:color w:val="EE0000"/>
+          <w:lang w:val="fr-FR"/>
+        </w:rPr>
+      </w:pPr>
+      <w:proofErr w:type="spellStart"/>
+      <w:r>
+        <w:rPr>
+          <w:b/>
+          <w:bCs/>
+          <w:color w:val="EE0000"/>
+          <w:lang w:val="fr-FR"/>
+        </w:rPr>
+        <w:t>Btn</w:t>
+      </w:r>
+      <w:proofErr w:type="spellEnd"/>
+      <w:r>
+        <w:rPr>
+          <w:color w:val="EE0000"/>
+          <w:lang w:val="fr-FR"/>
+        </w:rPr>
+        <w:t>-</w:t>
+      </w:r>
+      <w:r>
+        <w:rPr>
+          <w:color w:val="EE0000"/>
+          <w:lang w:val="fr-FR"/>
+        </w:rPr>
+        <w:t>Questionnaire</w:t>
+      </w:r>
+      <w:r>
+        <w:rPr>
+          <w:color w:val="EE0000"/>
+          <w:lang w:val="fr-FR"/>
+        </w:rPr>
+        <w:t xml:space="preserve"> </w:t>
+      </w:r>
+      <w:r>
+        <w:rPr>
+          <w:i/>
+          <w:iCs/>
+          <w:color w:val="FFC000"/>
+          <w:sz w:val="20"/>
+          <w:szCs w:val="20"/>
+          <w:lang w:val="fr-FR"/>
+        </w:rPr>
+        <w:t xml:space="preserve">– soucis avec la colonne </w:t>
+      </w:r>
+      <w:proofErr w:type="spellStart"/>
+      <w:r>
+        <w:rPr>
+          <w:i/>
+          <w:iCs/>
+          <w:color w:val="FFC000"/>
+          <w:sz w:val="20"/>
+          <w:szCs w:val="20"/>
+          <w:lang w:val="fr-FR"/>
+        </w:rPr>
+        <w:t>QuestionId</w:t>
+      </w:r>
+      <w:proofErr w:type="spellEnd"/>
+      <w:r>
+        <w:rPr>
+          <w:i/>
+          <w:iCs/>
+          <w:color w:val="FFC000"/>
+          <w:sz w:val="20"/>
+          <w:szCs w:val="20"/>
+          <w:lang w:val="fr-FR"/>
+        </w:rPr>
+        <w:t xml:space="preserve"> je veux le texte</w:t>
+      </w:r>
+    </w:p>
+    <w:p>
+      <w:pPr>
+        <w:pStyle w:val="Paragraphedeliste"/>
+        <w:numPr>
+          <w:ilvl w:val="1"/>
+          <w:numId w:val="5"/>
+        </w:numPr>
+        <w:rPr>
+          <w:highlight w:val="green"/>
+          <w:lang w:val="fr-FR"/>
+        </w:rPr>
+      </w:pPr>
+      <w:proofErr w:type="spellStart"/>
+      <w:r>
+        <w:rPr>
+          <w:color w:val="215E99" w:themeColor="text2" w:themeTint="BF"/>
+          <w:highlight w:val="green"/>
+          <w:lang w:val="fr-FR"/>
+        </w:rPr>
+        <w:t>QuestionList</w:t>
+      </w:r>
+      <w:proofErr w:type="spellEnd"/>
+      <w:r>
+        <w:rPr>
+          <w:highlight w:val="green"/>
+          <w:lang w:val="fr-FR"/>
+        </w:rPr>
+        <w:t xml:space="preserve"> (bouton Nouveau)</w:t>
+      </w:r>
+    </w:p>
+    <w:p>
+      <w:pPr>
+        <w:pStyle w:val="Paragraphedeliste"/>
+        <w:numPr>
+          <w:ilvl w:val="2"/>
+          <w:numId w:val="5"/>
+        </w:numPr>
+        <w:rPr>
+          <w:color w:val="B4B4B4"/>
+          <w:lang w:val="fr-FR"/>
+        </w:rPr>
+      </w:pPr>
+      <w:proofErr w:type="spellStart"/>
+      <w:r>
+        <w:rPr>
+          <w:color w:val="B4B4B4"/>
+          <w:lang w:val="fr-FR"/>
+        </w:rPr>
+        <w:t>NewQuestion</w:t>
+      </w:r>
+      <w:r>
+        <w:rPr>
+          <w:color w:val="B4B4B4"/>
+          <w:lang w:val="fr-FR"/>
+        </w:rPr>
+        <w:t>Form</w:t>
+      </w:r>
+      <w:proofErr w:type="spellEnd"/>
+    </w:p>
+    <w:p>
+      <w:pPr>
+        <w:pStyle w:val="Paragraphedeliste"/>
+        <w:pBdr>
+          <w:top w:val="single" w:sz="4" w:space="1" w:color="auto"/>
+          <w:left w:val="single" w:sz="4" w:space="4" w:color="auto"/>
+          <w:bottom w:val="single" w:sz="4" w:space="1" w:color="auto"/>
+          <w:right w:val="single" w:sz="4" w:space="4" w:color="auto"/>
+        </w:pBdr>
+        <w:ind w:left="2520"/>
+        <w:rPr>
+          <w:lang w:val="fr-FR"/>
+        </w:rPr>
+      </w:pPr>
+      <w:proofErr w:type="spellStart"/>
+      <w:r>
+        <w:rPr>
+          <w:b/>
+          <w:bCs/>
+          <w:highlight w:val="green"/>
+          <w:lang w:val="fr-FR"/>
+        </w:rPr>
+        <w:t>Btn</w:t>
+      </w:r>
+      <w:proofErr w:type="spellEnd"/>
+      <w:r>
+        <w:rPr>
+          <w:highlight w:val="green"/>
+          <w:lang w:val="fr-FR"/>
+        </w:rPr>
+        <w:t>-Nouveau</w:t>
+      </w:r>
+    </w:p>
+    <w:p>
+      <w:pPr>
+        <w:pStyle w:val="Paragraphedeliste"/>
+        <w:numPr>
+          <w:ilvl w:val="3"/>
+          <w:numId w:val="5"/>
+        </w:numPr>
+        <w:rPr>
+          <w:lang w:val="fr-FR"/>
+        </w:rPr>
+      </w:pPr>
+      <w:r>
+        <w:rPr>
+          <w:lang w:val="fr-FR"/>
+        </w:rPr>
+        <w:t>Id, Texte, Ordre</w:t>
+      </w:r>
+      <w:r>
+        <w:rPr>
+          <w:lang w:val="fr-FR"/>
+        </w:rPr>
+        <w:t>, Question parent (si existant)</w:t>
+      </w:r>
+    </w:p>
+    <w:p>
+      <w:pPr>
+        <w:pStyle w:val="Paragraphedeliste"/>
+        <w:ind w:left="1800"/>
+        <w:rPr>
+          <w:lang w:val="fr-FR"/>
+        </w:rPr>
+      </w:pPr>
+    </w:p>
+    <w:p>
+      <w:pPr>
+        <w:rPr>
+          <w:lang w:val="fr-FR"/>
+        </w:rPr>
+      </w:pPr>
+      <w:r>
+        <w:rPr>
+          <w:lang w:val="fr-FR"/>
+        </w:rPr>
+        <w:t>8</w:t>
+      </w:r>
+      <w:r>
+        <w:rPr>
+          <w:lang w:val="fr-FR"/>
+        </w:rPr>
+        <w:t xml:space="preserve"> </w:t>
+      </w:r>
+      <w:proofErr w:type="spellStart"/>
+      <w:r>
+        <w:rPr>
+          <w:lang w:val="fr-FR"/>
+        </w:rPr>
+        <w:t>views</w:t>
+      </w:r>
+      <w:proofErr w:type="spellEnd"/>
+    </w:p>
+    <w:p>
+      <w:pPr>
+        <w:rPr>
+          <w:lang w:val="fr-FR"/>
+        </w:rPr>
+      </w:pPr>
+      <w:r>
+        <w:rPr>
+          <w:lang w:val="fr-FR"/>
+        </w:rPr>
+        <w:br w:type="page"/>
+      </w:r>
+    </w:p>
+    <w:p>
+      <w:pPr>
+        <w:rPr>
+          <w:lang w:val="fr-FR"/>
+        </w:rPr>
+      </w:pPr>
+      <w:r>
+        <w:rPr>
+          <w:lang w:val="fr-FR"/>
+        </w:rPr>
+        <w:lastRenderedPageBreak/>
         <w:t>L’utilisateur : employé blackbox</w:t>
       </w:r>
     </w:p>
@@ -458,7 +1395,21 @@
         <w:rPr>
           <w:lang w:val="fr-FR"/>
         </w:rPr>
-        <w:t xml:space="preserve"> mais ou il peut encore </w:t>
+        <w:t xml:space="preserve"> mais </w:t>
+      </w:r>
+      <w:proofErr w:type="spellStart"/>
+      <w:r>
+        <w:rPr>
+          <w:lang w:val="fr-FR"/>
+        </w:rPr>
+        <w:t>ou</w:t>
+      </w:r>
+      <w:proofErr w:type="spellEnd"/>
+      <w:r>
+        <w:rPr>
+          <w:lang w:val="fr-FR"/>
+        </w:rPr>
+        <w:t xml:space="preserve"> il peut encore </w:t>
       </w:r>
       <w:proofErr w:type="spellStart"/>
       <w:r>
@@ -682,6 +1633,232 @@
 <file path=word/numbering.xml><?xml version="1.0" encoding="utf-8"?>
 <w:numbering xmlns:wpc="http://schemas.microsoft.com/office/word/2010/wordprocessingCanvas" xmlns:cx="http://schemas.microsoft.com/office/drawing/2014/chartex" xmlns:cx1="http://schemas.microsoft.com/office/drawing/2015/9/8/chartex" xmlns:cx2="http://schemas.microsoft.com/office/drawing/2015/10/21/chartex" xmlns:cx3="http://schemas.microsoft.com/office/drawing/2016/5/9/chartex" xmlns:cx4="http://schemas.microsoft.com/office/drawing/2016/5/10/chartex" xmlns:cx5="http://schemas.microsoft.com/office/drawing/2016/5/11/chartex" xmlns:cx6="http://schemas.microsoft.com/office/drawing/2016/5/12/chartex" xmlns:cx7="http://schemas.microsoft.com/office/drawing/2016/5/13/chartex" xmlns:cx8="http://schemas.microsoft.com/office/drawing/2016/5/14/chartex" xmlns:mc="http://schemas.openxmlformats.org/markup-compatibility/2006" xmlns:aink="http://schemas.microsoft.com/office/drawing/2016/ink" xmlns:am3d="http://schemas.microsoft.com/office/drawing/2017/model3d" xmlns:o="urn:schemas-microsoft-com:office:office" xmlns:oel="http://schemas.microsoft.com/office/2019/extlst" xmlns:r="http://schemas.openxmlformats.org/officeDocument/2006/relationships" xmlns:m="http://schemas.openxmlformats.org/officeDocument/2006/math" xmlns:v="urn:schemas-microsoft-com:vml" xmlns:wp14="http://schemas.microsoft.com/office/word/2010/wordprocessingDrawing" xmlns:wp="http://schemas.openxmlformats.org/drawingml/2006/wordprocessingDrawing" xmlns:w10="urn:schemas-microsoft-com:office:word" xmlns:w="http://schemas.openxmlformats.org/wordprocessingml/2006/main" xmlns:w14="http://schemas.microsoft.com/office/word/2010/wordml" xmlns:w15="http://schemas.microsoft.com/office/word/2012/wordml" xmlns:w16cex="http://schemas.microsoft.com/office/word/2018/wordml/cex" xmlns:w16cid="http://schemas.microsoft.com/office/word/2016/wordml/cid" xmlns:w16="http://schemas.microsoft.com/office/word/2018/wordml" xmlns:w16du="http://schemas.microsoft.com/office/word/2023/wordml/word16du" xmlns:w16sdtdh="http://schemas.microsoft.com/office/word/2020/wordml/sdtdatahash" xmlns:w16sdtfl="http://schemas.microsoft.com/office/word/2024/wordml/sdtformatlock" xmlns:w16se="http://schemas.microsoft.com/office/word/2015/wordml/symex" xmlns:wpg="http://schemas.microsoft.com/office/word/2010/wordprocessingGroup" xmlns:wpi="http://schemas.microsoft.com/office/word/2010/wordprocessingInk" xmlns:wne="http://schemas.microsoft.com/office/word/2006/wordml" xmlns:wps="http://schemas.microsoft.com/office/word/2010/wordprocessingShape" mc:Ignorable="w14 w15 w16se w16cid w16 w16cex w16sdtdh w16sdtfl w16du wp14">
   <w:abstractNum w:abstractNumId="0" w15:restartNumberingAfterBreak="0">
+    <w:nsid w:val="160C1001"/>
+    <w:multiLevelType w:val="hybridMultilevel"/>
+    <w:tmpl w:val="8A82389C"/>
+    <w:lvl w:ilvl="0" w:tplc="F2AC3A4A">
+      <w:start w:val="1"/>
+      <w:numFmt w:val="bullet"/>
+      <w:lvlText w:val="-"/>
+      <w:lvlJc w:val="left"/>
+      <w:pPr>
+        <w:ind w:left="1080" w:hanging="360"/>
+      </w:pPr>
+      <w:rPr>
+        <w:rFonts w:ascii="Aptos" w:eastAsiaTheme="minorHAnsi" w:hAnsi="Aptos" w:cstheme="minorBidi" w:hint="default"/>
+      </w:rPr>
+    </w:lvl>
+    <w:lvl w:ilvl="1" w:tplc="100C0003">
+      <w:start w:val="1"/>
+      <w:numFmt w:val="bullet"/>
+      <w:lvlText w:val="o"/>
+      <w:lvlJc w:val="left"/>
+      <w:pPr>
+        <w:ind w:left="1800" w:hanging="360"/>
+      </w:pPr>
+      <w:rPr>
+        <w:rFonts w:ascii="Courier New" w:hAnsi="Courier New" w:cs="Courier New" w:hint="default"/>
+      </w:rPr>
+    </w:lvl>
+    <w:lvl w:ilvl="2" w:tplc="100C0005">
+      <w:start w:val="1"/>
+      <w:numFmt w:val="bullet"/>
+      <w:lvlText w:val=""/>
+      <w:lvlJc w:val="left"/>
+      <w:pPr>
+        <w:ind w:left="2520" w:hanging="360"/>
+      </w:pPr>
+      <w:rPr>
+        <w:rFonts w:ascii="Wingdings" w:hAnsi="Wingdings" w:hint="default"/>
+      </w:rPr>
+    </w:lvl>
+    <w:lvl w:ilvl="3" w:tplc="100C0001">
+      <w:start w:val="1"/>
+      <w:numFmt w:val="bullet"/>
+      <w:lvlText w:val=""/>
+      <w:lvlJc w:val="left"/>
+      <w:pPr>
+        <w:ind w:left="3240" w:hanging="360"/>
+      </w:pPr>
+      <w:rPr>
+        <w:rFonts w:ascii="Symbol" w:hAnsi="Symbol" w:hint="default"/>
+      </w:rPr>
+    </w:lvl>
+    <w:lvl w:ilvl="4" w:tplc="100C0003" w:tentative="1">
+      <w:start w:val="1"/>
+      <w:numFmt w:val="bullet"/>
+      <w:lvlText w:val="o"/>
+      <w:lvlJc w:val="left"/>
+      <w:pPr>
+        <w:ind w:left="3960" w:hanging="360"/>
+      </w:pPr>
+      <w:rPr>
+        <w:rFonts w:ascii="Courier New" w:hAnsi="Courier New" w:cs="Courier New" w:hint="default"/>
+      </w:rPr>
+    </w:lvl>
+    <w:lvl w:ilvl="5" w:tplc="100C0005" w:tentative="1">
+      <w:start w:val="1"/>
+      <w:numFmt w:val="bullet"/>
+      <w:lvlText w:val=""/>
+      <w:lvlJc w:val="left"/>
+      <w:pPr>
+        <w:ind w:left="4680" w:hanging="360"/>
+      </w:pPr>
+      <w:rPr>
+        <w:rFonts w:ascii="Wingdings" w:hAnsi="Wingdings" w:hint="default"/>
+      </w:rPr>
+    </w:lvl>
+    <w:lvl w:ilvl="6" w:tplc="100C0001" w:tentative="1">
+      <w:start w:val="1"/>
+      <w:numFmt w:val="bullet"/>
+      <w:lvlText w:val=""/>
+      <w:lvlJc w:val="left"/>
+      <w:pPr>
+        <w:ind w:left="5400" w:hanging="360"/>
+      </w:pPr>
+      <w:rPr>
+        <w:rFonts w:ascii="Symbol" w:hAnsi="Symbol" w:hint="default"/>
+      </w:rPr>
+    </w:lvl>
+    <w:lvl w:ilvl="7" w:tplc="100C0003" w:tentative="1">
+      <w:start w:val="1"/>
+      <w:numFmt w:val="bullet"/>
+      <w:lvlText w:val="o"/>
+      <w:lvlJc w:val="left"/>
+      <w:pPr>
+        <w:ind w:left="6120" w:hanging="360"/>
+      </w:pPr>
+      <w:rPr>
+        <w:rFonts w:ascii="Courier New" w:hAnsi="Courier New" w:cs="Courier New" w:hint="default"/>
+      </w:rPr>
+    </w:lvl>
+    <w:lvl w:ilvl="8" w:tplc="100C0005" w:tentative="1">
+      <w:start w:val="1"/>
+      <w:numFmt w:val="bullet"/>
+      <w:lvlText w:val=""/>
+      <w:lvlJc w:val="left"/>
+      <w:pPr>
+        <w:ind w:left="6840" w:hanging="360"/>
+      </w:pPr>
+      <w:rPr>
+        <w:rFonts w:ascii="Wingdings" w:hAnsi="Wingdings" w:hint="default"/>
+      </w:rPr>
+    </w:lvl>
+  </w:abstractNum>
+  <w:abstractNum w:abstractNumId="1" w15:restartNumberingAfterBreak="0">
+    <w:nsid w:val="2B547A5D"/>
+    <w:multiLevelType w:val="hybridMultilevel"/>
+    <w:tmpl w:val="BA4EEC14"/>
+    <w:lvl w:ilvl="0" w:tplc="90EC1004">
+      <w:start w:val="1"/>
+      <w:numFmt w:val="bullet"/>
+      <w:lvlText w:val="-"/>
+      <w:lvlJc w:val="left"/>
+      <w:pPr>
+        <w:ind w:left="720" w:hanging="360"/>
+      </w:pPr>
+      <w:rPr>
+        <w:rFonts w:ascii="Aptos" w:eastAsiaTheme="minorHAnsi" w:hAnsi="Aptos" w:cstheme="minorBidi" w:hint="default"/>
+      </w:rPr>
+    </w:lvl>
+    <w:lvl w:ilvl="1" w:tplc="100C0003" w:tentative="1">
+      <w:start w:val="1"/>
+      <w:numFmt w:val="bullet"/>
+      <w:lvlText w:val="o"/>
+      <w:lvlJc w:val="left"/>
+      <w:pPr>
+        <w:ind w:left="1440" w:hanging="360"/>
+      </w:pPr>
+      <w:rPr>
+        <w:rFonts w:ascii="Courier New" w:hAnsi="Courier New" w:cs="Courier New" w:hint="default"/>
+      </w:rPr>
+    </w:lvl>
+    <w:lvl w:ilvl="2" w:tplc="100C0005" w:tentative="1">
+      <w:start w:val="1"/>
+      <w:numFmt w:val="bullet"/>
+      <w:lvlText w:val=""/>
+      <w:lvlJc w:val="left"/>
+      <w:pPr>
+        <w:ind w:left="2160" w:hanging="360"/>
+      </w:pPr>
+      <w:rPr>
+        <w:rFonts w:ascii="Wingdings" w:hAnsi="Wingdings" w:hint="default"/>
+      </w:rPr>
+    </w:lvl>
+    <w:lvl w:ilvl="3" w:tplc="100C0001" w:tentative="1">
+      <w:start w:val="1"/>
+      <w:numFmt w:val="bullet"/>
+      <w:lvlText w:val=""/>
+      <w:lvlJc w:val="left"/>
+      <w:pPr>
+        <w:ind w:left="2880" w:hanging="360"/>
+      </w:pPr>
+      <w:rPr>
+        <w:rFonts w:ascii="Symbol" w:hAnsi="Symbol" w:hint="default"/>
+      </w:rPr>
+    </w:lvl>
+    <w:lvl w:ilvl="4" w:tplc="100C0003" w:tentative="1">
+      <w:start w:val="1"/>
+      <w:numFmt w:val="bullet"/>
+      <w:lvlText w:val="o"/>
+      <w:lvlJc w:val="left"/>
+      <w:pPr>
+        <w:ind w:left="3600" w:hanging="360"/>
+      </w:pPr>
+      <w:rPr>
+        <w:rFonts w:ascii="Courier New" w:hAnsi="Courier New" w:cs="Courier New" w:hint="default"/>
+      </w:rPr>
+    </w:lvl>
+    <w:lvl w:ilvl="5" w:tplc="100C0005" w:tentative="1">
+      <w:start w:val="1"/>
+      <w:numFmt w:val="bullet"/>
+      <w:lvlText w:val=""/>
+      <w:lvlJc w:val="left"/>
+      <w:pPr>
+        <w:ind w:left="4320" w:hanging="360"/>
+      </w:pPr>
+      <w:rPr>
+        <w:rFonts w:ascii="Wingdings" w:hAnsi="Wingdings" w:hint="default"/>
+      </w:rPr>
+    </w:lvl>
+    <w:lvl w:ilvl="6" w:tplc="100C0001" w:tentative="1">
+      <w:start w:val="1"/>
+      <w:numFmt w:val="bullet"/>
+      <w:lvlText w:val=""/>
+      <w:lvlJc w:val="left"/>
+      <w:pPr>
+        <w:ind w:left="5040" w:hanging="360"/>
+      </w:pPr>
+      <w:rPr>
+        <w:rFonts w:ascii="Symbol" w:hAnsi="Symbol" w:hint="default"/>
+      </w:rPr>
+    </w:lvl>
+    <w:lvl w:ilvl="7" w:tplc="100C0003" w:tentative="1">
+      <w:start w:val="1"/>
+      <w:numFmt w:val="bullet"/>
+      <w:lvlText w:val="o"/>
+      <w:lvlJc w:val="left"/>
+      <w:pPr>
+        <w:ind w:left="5760" w:hanging="360"/>
+      </w:pPr>
+      <w:rPr>
+        <w:rFonts w:ascii="Courier New" w:hAnsi="Courier New" w:cs="Courier New" w:hint="default"/>
+      </w:rPr>
+    </w:lvl>
+    <w:lvl w:ilvl="8" w:tplc="100C0005" w:tentative="1">
+      <w:start w:val="1"/>
+      <w:numFmt w:val="bullet"/>
+      <w:lvlText w:val=""/>
+      <w:lvlJc w:val="left"/>
+      <w:pPr>
+        <w:ind w:left="6480" w:hanging="360"/>
+      </w:pPr>
+      <w:rPr>
+        <w:rFonts w:ascii="Wingdings" w:hAnsi="Wingdings" w:hint="default"/>
+      </w:rPr>
+    </w:lvl>
+  </w:abstractNum>
+  <w:abstractNum w:abstractNumId="2" w15:restartNumberingAfterBreak="0">
     <w:nsid w:val="515C004E"/>
     <w:multiLevelType w:val="hybridMultilevel"/>
     <w:tmpl w:val="06E00886"/>
@@ -794,7 +1971,7 @@
       </w:rPr>
     </w:lvl>
   </w:abstractNum>
-  <w:abstractNum w:abstractNumId="1" w15:restartNumberingAfterBreak="0">
+  <w:abstractNum w:abstractNumId="3" w15:restartNumberingAfterBreak="0">
     <w:nsid w:val="6D762745"/>
     <w:multiLevelType w:val="hybridMultilevel"/>
     <w:tmpl w:val="E2A8D696"/>
@@ -883,7 +2060,7 @@
       </w:pPr>
     </w:lvl>
   </w:abstractNum>
-  <w:abstractNum w:abstractNumId="2" w15:restartNumberingAfterBreak="0">
+  <w:abstractNum w:abstractNumId="4" w15:restartNumberingAfterBreak="0">
     <w:nsid w:val="7F71773C"/>
     <w:multiLevelType w:val="hybridMultilevel"/>
     <w:tmpl w:val="0A687100"/>
@@ -973,13 +2150,19 @@
     </w:lvl>
   </w:abstractNum>
   <w:num w:numId="1" w16cid:durableId="73014860">
+    <w:abstractNumId w:val="3"/>
+  </w:num>
+  <w:num w:numId="2" w16cid:durableId="1334796613">
+    <w:abstractNumId w:val="2"/>
+  </w:num>
+  <w:num w:numId="3" w16cid:durableId="969551527">
+    <w:abstractNumId w:val="4"/>
+  </w:num>
+  <w:num w:numId="4" w16cid:durableId="1491361125">
     <w:abstractNumId w:val="1"/>
   </w:num>
-  <w:num w:numId="2" w16cid:durableId="1334796613">
+  <w:num w:numId="5" w16cid:durableId="1110970384">
     <w:abstractNumId w:val="0"/>
-  </w:num>
-  <w:num w:numId="3" w16cid:durableId="969551527">
-    <w:abstractNumId w:val="2"/>
   </w:num>
 </w:numbering>
 </file>

</xml_diff>

<commit_message>
corrections et continuer le code
</commit_message>
<xml_diff>
--- a/logique de code.docx
+++ b/logique de code.docx
@@ -8,14 +8,12 @@
           <w:lang w:val="fr-FR"/>
         </w:rPr>
       </w:pPr>
-      <w:proofErr w:type="spellStart"/>
       <w:r>
         <w:rPr>
           <w:lang w:val="fr-FR"/>
         </w:rPr>
         <w:t>MainMenu</w:t>
       </w:r>
-      <w:proofErr w:type="spellEnd"/>
     </w:p>
     <w:p>
       <w:pPr>
@@ -49,7 +47,6 @@
           <w:lang w:val="fr-FR"/>
         </w:rPr>
       </w:pPr>
-      <w:proofErr w:type="spellStart"/>
       <w:r>
         <w:rPr>
           <w:b/>
@@ -59,7 +56,6 @@
         </w:rPr>
         <w:t>Btn</w:t>
       </w:r>
-      <w:proofErr w:type="spellEnd"/>
       <w:r>
         <w:rPr>
           <w:highlight w:val="green"/>
@@ -88,7 +84,6 @@
           <w:lang w:val="fr-FR"/>
         </w:rPr>
       </w:pPr>
-      <w:proofErr w:type="spellStart"/>
       <w:r>
         <w:rPr>
           <w:color w:val="0F9ED5" w:themeColor="accent4"/>
@@ -97,7 +92,6 @@
         </w:rPr>
         <w:t>NewClientForm</w:t>
       </w:r>
-      <w:proofErr w:type="spellEnd"/>
     </w:p>
     <w:p>
       <w:pPr>
@@ -145,31 +139,7 @@
           <w:szCs w:val="20"/>
           <w:lang w:val="fr-FR"/>
         </w:rPr>
-        <w:t xml:space="preserve">Trop compliqué pour le moment JS nécessaire. Je dois masquer et afficher des lignes en fonctions de </w:t>
-      </w:r>
-      <w:proofErr w:type="spellStart"/>
-      <w:r>
-        <w:rPr>
-          <w:i/>
-          <w:iCs/>
-          <w:color w:val="FFC000"/>
-          <w:sz w:val="20"/>
-          <w:szCs w:val="20"/>
-          <w:lang w:val="fr-FR"/>
-        </w:rPr>
-        <w:t>questionId</w:t>
-      </w:r>
-      <w:proofErr w:type="spellEnd"/>
-      <w:r>
-        <w:rPr>
-          <w:i/>
-          <w:iCs/>
-          <w:color w:val="FFC000"/>
-          <w:sz w:val="20"/>
-          <w:szCs w:val="20"/>
-          <w:lang w:val="fr-FR"/>
-        </w:rPr>
-        <w:t xml:space="preserve"> == Null et réponse == oui</w:t>
+        <w:t>Trop compliqué pour le moment JS nécessaire. Je dois masquer et afficher des lignes en fonctions de questionId == Null et réponse == oui</w:t>
       </w:r>
     </w:p>
     <w:p>
@@ -230,7 +200,6 @@
           <w:lang w:val="fr-FR"/>
         </w:rPr>
       </w:pPr>
-      <w:proofErr w:type="spellStart"/>
       <w:r>
         <w:rPr>
           <w:b/>
@@ -240,7 +209,6 @@
         </w:rPr>
         <w:t>Btn</w:t>
       </w:r>
-      <w:proofErr w:type="spellEnd"/>
       <w:r>
         <w:rPr>
           <w:highlight w:val="green"/>
@@ -267,7 +235,6 @@
           <w:lang w:val="fr-FR"/>
         </w:rPr>
       </w:pPr>
-      <w:proofErr w:type="spellStart"/>
       <w:r>
         <w:rPr>
           <w:color w:val="E59EDC" w:themeColor="accent5" w:themeTint="66"/>
@@ -275,7 +242,6 @@
         </w:rPr>
         <w:t>DisplayClientList</w:t>
       </w:r>
-      <w:proofErr w:type="spellEnd"/>
       <w:r>
         <w:rPr>
           <w:color w:val="A02B93" w:themeColor="accent5"/>
@@ -287,49 +253,35 @@
         <w:rPr>
           <w:lang w:val="fr-FR"/>
         </w:rPr>
-        <w:t xml:space="preserve">(2 boutons </w:t>
-      </w:r>
-      <w:proofErr w:type="spellStart"/>
-      <w:r>
-        <w:rPr>
-          <w:lang w:val="fr-FR"/>
-        </w:rPr>
-        <w:t>inline</w:t>
-      </w:r>
-      <w:proofErr w:type="spellEnd"/>
-      <w:r>
-        <w:rPr>
-          <w:lang w:val="fr-FR"/>
-        </w:rPr>
-        <w:t xml:space="preserve"> « </w:t>
-      </w:r>
-      <w:proofErr w:type="spellStart"/>
-      <w:r>
-        <w:rPr>
-          <w:lang w:val="fr-FR"/>
-        </w:rPr>
-        <w:t>modify</w:t>
-      </w:r>
-      <w:proofErr w:type="spellEnd"/>
-      <w:r>
-        <w:rPr>
-          <w:lang w:val="fr-FR"/>
-        </w:rPr>
-        <w:t> » 1 bouton « </w:t>
-      </w:r>
-      <w:proofErr w:type="spellStart"/>
-      <w:r>
-        <w:rPr>
-          <w:lang w:val="fr-FR"/>
-        </w:rPr>
-        <w:t>consult</w:t>
-      </w:r>
-      <w:proofErr w:type="spellEnd"/>
-      <w:r>
-        <w:rPr>
-          <w:lang w:val="fr-FR"/>
-        </w:rPr>
-        <w:t> »)</w:t>
+        <w:t>3 boutons (mod. client, mod questionnaire, consulter resultat)</w:t>
+      </w:r>
+    </w:p>
+    <w:p>
+      <w:pPr>
+        <w:pStyle w:val="Paragraphedeliste"/>
+        <w:numPr>
+          <w:ilvl w:val="0"/>
+          <w:numId w:val="5"/>
+        </w:numPr>
+        <w:rPr>
+          <w:i/>
+          <w:iCs/>
+          <w:color w:val="FFC000"/>
+          <w:sz w:val="20"/>
+          <w:szCs w:val="20"/>
+          <w:lang w:val="fr-FR"/>
+        </w:rPr>
+      </w:pPr>
+      <w:r>
+        <w:rPr>
+          <w:i/>
+          <w:iCs/>
+          <w:color w:val="FFC000"/>
+          <w:sz w:val="20"/>
+          <w:szCs w:val="20"/>
+          <w:lang w:val="fr-FR"/>
+        </w:rPr>
+        <w:t>Reste les boutons a lier</w:t>
       </w:r>
     </w:p>
     <w:p>
@@ -346,7 +298,6 @@
           <w:lang w:val="fr-FR"/>
         </w:rPr>
       </w:pPr>
-      <w:proofErr w:type="spellStart"/>
       <w:r>
         <w:rPr>
           <w:b/>
@@ -355,7 +306,6 @@
         </w:rPr>
         <w:t>Btn</w:t>
       </w:r>
-      <w:proofErr w:type="spellEnd"/>
       <w:r>
         <w:rPr>
           <w:lang w:val="fr-FR"/>
@@ -380,15 +330,13 @@
           <w:lang w:val="fr-FR"/>
         </w:rPr>
       </w:pPr>
-      <w:proofErr w:type="spellStart"/>
       <w:r>
         <w:rPr>
           <w:color w:val="0F9ED5" w:themeColor="accent4"/>
           <w:lang w:val="fr-FR"/>
         </w:rPr>
-        <w:t>NewClientForm</w:t>
-      </w:r>
-      <w:proofErr w:type="spellEnd"/>
+        <w:t>UpdateClient</w:t>
+      </w:r>
       <w:r>
         <w:rPr>
           <w:lang w:val="fr-FR"/>
@@ -410,7 +358,6 @@
           <w:lang w:val="fr-FR"/>
         </w:rPr>
       </w:pPr>
-      <w:proofErr w:type="spellStart"/>
       <w:r>
         <w:rPr>
           <w:b/>
@@ -419,7 +366,6 @@
         </w:rPr>
         <w:t>Btn</w:t>
       </w:r>
-      <w:proofErr w:type="spellEnd"/>
       <w:r>
         <w:rPr>
           <w:lang w:val="fr-FR"/>
@@ -450,7 +396,7 @@
           <w:color w:val="196B24" w:themeColor="accent3"/>
           <w:lang w:val="fr-FR"/>
         </w:rPr>
-        <w:t>Question</w:t>
+        <w:t>UpdateQuestion</w:t>
       </w:r>
       <w:r>
         <w:rPr>
@@ -480,7 +426,6 @@
           <w:lang w:val="fr-FR"/>
         </w:rPr>
       </w:pPr>
-      <w:proofErr w:type="spellStart"/>
       <w:r>
         <w:rPr>
           <w:b/>
@@ -489,7 +434,6 @@
         </w:rPr>
         <w:t>Btn</w:t>
       </w:r>
-      <w:proofErr w:type="spellEnd"/>
       <w:r>
         <w:rPr>
           <w:lang w:val="fr-FR"/>
@@ -550,7 +494,6 @@
           <w:lang w:val="fr-FR"/>
         </w:rPr>
       </w:pPr>
-      <w:proofErr w:type="spellStart"/>
       <w:r>
         <w:rPr>
           <w:b/>
@@ -560,7 +503,6 @@
         </w:rPr>
         <w:t>Btn</w:t>
       </w:r>
-      <w:proofErr w:type="spellEnd"/>
       <w:r>
         <w:rPr>
           <w:highlight w:val="green"/>
@@ -588,7 +530,6 @@
           <w:lang w:val="fr-FR"/>
         </w:rPr>
       </w:pPr>
-      <w:proofErr w:type="spellStart"/>
       <w:r>
         <w:rPr>
           <w:color w:val="C00000"/>
@@ -597,7 +538,6 @@
         </w:rPr>
         <w:t>SecteurActiviteList</w:t>
       </w:r>
-      <w:proofErr w:type="spellEnd"/>
       <w:r>
         <w:rPr>
           <w:highlight w:val="green"/>
@@ -618,7 +558,6 @@
           <w:lang w:val="fr-FR"/>
         </w:rPr>
       </w:pPr>
-      <w:proofErr w:type="spellStart"/>
       <w:r>
         <w:rPr>
           <w:color w:val="8DD873" w:themeColor="accent6" w:themeTint="99"/>
@@ -633,7 +572,6 @@
         </w:rPr>
         <w:t>Form</w:t>
       </w:r>
-      <w:proofErr w:type="spellEnd"/>
     </w:p>
     <w:p>
       <w:pPr>
@@ -649,7 +587,6 @@
           <w:lang w:val="fr-FR"/>
         </w:rPr>
       </w:pPr>
-      <w:proofErr w:type="spellStart"/>
       <w:r>
         <w:rPr>
           <w:b/>
@@ -659,7 +596,6 @@
         </w:rPr>
         <w:t>Btn</w:t>
       </w:r>
-      <w:proofErr w:type="spellEnd"/>
       <w:r>
         <w:rPr>
           <w:highlight w:val="green"/>
@@ -683,21 +619,7 @@
         <w:rPr>
           <w:lang w:val="fr-FR"/>
         </w:rPr>
-        <w:t>Id, Nom, Description (</w:t>
-      </w:r>
-      <w:proofErr w:type="spellStart"/>
-      <w:r>
-        <w:rPr>
-          <w:lang w:val="fr-FR"/>
-        </w:rPr>
-        <w:t>ApplicationOdoo</w:t>
-      </w:r>
-      <w:proofErr w:type="spellEnd"/>
-      <w:r>
-        <w:rPr>
-          <w:lang w:val="fr-FR"/>
-        </w:rPr>
-        <w:t>, Questions)</w:t>
+        <w:t>Id, Nom, Description (ApplicationOdoo, Questions)</w:t>
       </w:r>
     </w:p>
     <w:p>
@@ -715,7 +637,6 @@
           <w:lang w:val="fr-FR"/>
         </w:rPr>
       </w:pPr>
-      <w:proofErr w:type="spellStart"/>
       <w:r>
         <w:rPr>
           <w:b/>
@@ -725,7 +646,6 @@
         </w:rPr>
         <w:t>Btn</w:t>
       </w:r>
-      <w:proofErr w:type="spellEnd"/>
       <w:r>
         <w:rPr>
           <w:color w:val="EE0000"/>
@@ -756,31 +676,7 @@
           <w:szCs w:val="20"/>
           <w:lang w:val="fr-FR"/>
         </w:rPr>
-        <w:t xml:space="preserve">– soucis avec la colonne </w:t>
-      </w:r>
-      <w:proofErr w:type="spellStart"/>
-      <w:r>
-        <w:rPr>
-          <w:i/>
-          <w:iCs/>
-          <w:color w:val="FFC000"/>
-          <w:sz w:val="20"/>
-          <w:szCs w:val="20"/>
-          <w:lang w:val="fr-FR"/>
-        </w:rPr>
-        <w:t>QuestionId</w:t>
-      </w:r>
-      <w:proofErr w:type="spellEnd"/>
-      <w:r>
-        <w:rPr>
-          <w:i/>
-          <w:iCs/>
-          <w:color w:val="FFC000"/>
-          <w:sz w:val="20"/>
-          <w:szCs w:val="20"/>
-          <w:lang w:val="fr-FR"/>
-        </w:rPr>
-        <w:t xml:space="preserve"> je veux le texte</w:t>
+        <w:t>– soucis avec la colonne QuestionId je veux le texte</w:t>
       </w:r>
     </w:p>
     <w:p>
@@ -795,7 +691,6 @@
           <w:lang w:val="fr-FR"/>
         </w:rPr>
       </w:pPr>
-      <w:proofErr w:type="spellStart"/>
       <w:r>
         <w:rPr>
           <w:color w:val="215E99" w:themeColor="text2" w:themeTint="BF"/>
@@ -804,7 +699,6 @@
         </w:rPr>
         <w:t>QuestionList</w:t>
       </w:r>
-      <w:proofErr w:type="spellEnd"/>
       <w:r>
         <w:rPr>
           <w:highlight w:val="green"/>
@@ -825,7 +719,6 @@
           <w:lang w:val="fr-FR"/>
         </w:rPr>
       </w:pPr>
-      <w:proofErr w:type="spellStart"/>
       <w:r>
         <w:rPr>
           <w:color w:val="B4B4B4"/>
@@ -840,7 +733,6 @@
         </w:rPr>
         <w:t>Form</w:t>
       </w:r>
-      <w:proofErr w:type="spellEnd"/>
     </w:p>
     <w:p>
       <w:pPr>
@@ -856,7 +748,6 @@
           <w:lang w:val="fr-FR"/>
         </w:rPr>
       </w:pPr>
-      <w:proofErr w:type="spellStart"/>
       <w:r>
         <w:rPr>
           <w:b/>
@@ -866,7 +757,6 @@
         </w:rPr>
         <w:t>Btn</w:t>
       </w:r>
-      <w:proofErr w:type="spellEnd"/>
       <w:r>
         <w:rPr>
           <w:highlight w:val="green"/>
@@ -924,16 +814,8 @@
         <w:rPr>
           <w:lang w:val="fr-FR"/>
         </w:rPr>
-        <w:t xml:space="preserve"> </w:t>
-      </w:r>
-      <w:proofErr w:type="spellStart"/>
-      <w:r>
-        <w:rPr>
-          <w:lang w:val="fr-FR"/>
-        </w:rPr>
-        <w:t>views</w:t>
-      </w:r>
-      <w:proofErr w:type="spellEnd"/>
+        <w:t xml:space="preserve"> views</w:t>
+      </w:r>
     </w:p>
     <w:p>
       <w:pPr>
@@ -1052,16 +934,8 @@
         <w:rPr>
           <w:lang w:val="fr-FR"/>
         </w:rPr>
-        <w:t xml:space="preserve">Création </w:t>
-      </w:r>
-      <w:proofErr w:type="spellStart"/>
-      <w:r>
-        <w:rPr>
-          <w:lang w:val="fr-FR"/>
-        </w:rPr>
-        <w:t>SecteurActivité</w:t>
-      </w:r>
-      <w:proofErr w:type="spellEnd"/>
+        <w:t>Création SecteurActivité</w:t>
+      </w:r>
     </w:p>
     <w:p>
       <w:pPr>
@@ -1129,30 +1003,8 @@
         <w:rPr>
           <w:lang w:val="fr-FR"/>
         </w:rPr>
-        <w:t xml:space="preserve">Nom, Email, </w:t>
-      </w:r>
-      <w:proofErr w:type="spellStart"/>
-      <w:r>
-        <w:rPr>
-          <w:lang w:val="fr-FR"/>
-        </w:rPr>
-        <w:t>NobreEmploye</w:t>
-      </w:r>
-      <w:proofErr w:type="spellEnd"/>
-      <w:r>
-        <w:rPr>
-          <w:lang w:val="fr-FR"/>
-        </w:rPr>
-        <w:t xml:space="preserve">, </w:t>
-      </w:r>
-      <w:proofErr w:type="spellStart"/>
-      <w:r>
-        <w:rPr>
-          <w:lang w:val="fr-FR"/>
-        </w:rPr>
-        <w:t>SecteurActiviteId</w:t>
-      </w:r>
-      <w:proofErr w:type="spellEnd"/>
+        <w:t>Nom, Email, NobreEmploye, SecteurActiviteId</w:t>
+      </w:r>
       <w:r>
         <w:rPr>
           <w:lang w:val="fr-FR"/>
@@ -1165,16 +1017,8 @@
           <w:lang w:val="fr-FR"/>
         </w:rPr>
         <w:br/>
-        <w:t xml:space="preserve">Champ notes liées à </w:t>
-      </w:r>
-      <w:proofErr w:type="spellStart"/>
-      <w:r>
-        <w:rPr>
-          <w:lang w:val="fr-FR"/>
-        </w:rPr>
-        <w:t>Resultat</w:t>
-      </w:r>
-      <w:proofErr w:type="spellEnd"/>
+        <w:t>Champ notes liées à Resultat</w:t>
+      </w:r>
     </w:p>
     <w:p>
       <w:pPr>
@@ -1260,48 +1104,20 @@
         <w:rPr>
           <w:lang w:val="fr-FR"/>
         </w:rPr>
-        <w:t xml:space="preserve"> (</w:t>
-      </w:r>
-      <w:proofErr w:type="spellStart"/>
-      <w:r>
-        <w:rPr>
-          <w:lang w:val="fr-FR"/>
-        </w:rPr>
-        <w:t>higlight</w:t>
-      </w:r>
-      <w:proofErr w:type="spellEnd"/>
-      <w:r>
-        <w:rPr>
-          <w:lang w:val="fr-FR"/>
-        </w:rPr>
-        <w:t>), modifiable si clic sur réponse opposée</w:t>
-      </w:r>
-    </w:p>
-    <w:p>
-      <w:pPr>
-        <w:rPr>
-          <w:lang w:val="fr-FR"/>
-        </w:rPr>
-      </w:pPr>
-      <w:r>
-        <w:rPr>
-          <w:lang w:val="fr-FR"/>
-        </w:rPr>
-        <w:t xml:space="preserve">Si la réponse est liée à une </w:t>
-      </w:r>
-      <w:proofErr w:type="spellStart"/>
-      <w:r>
-        <w:rPr>
-          <w:lang w:val="fr-FR"/>
-        </w:rPr>
-        <w:t>quetsionID</w:t>
-      </w:r>
-      <w:proofErr w:type="spellEnd"/>
-      <w:r>
-        <w:rPr>
-          <w:lang w:val="fr-FR"/>
-        </w:rPr>
-        <w:t>, une nouvelle question s’</w:t>
+        <w:t xml:space="preserve"> (higlight), modifiable si clic sur réponse opposée</w:t>
+      </w:r>
+    </w:p>
+    <w:p>
+      <w:pPr>
+        <w:rPr>
+          <w:lang w:val="fr-FR"/>
+        </w:rPr>
+      </w:pPr>
+      <w:r>
+        <w:rPr>
+          <w:lang w:val="fr-FR"/>
+        </w:rPr>
+        <w:t>Si la réponse est liée à une quetsionID, une nouvelle question s’</w:t>
       </w:r>
       <w:r>
         <w:rPr>
@@ -1326,21 +1142,7 @@
         <w:rPr>
           <w:lang w:val="fr-FR"/>
         </w:rPr>
-        <w:t>Champ notes lié à Résultat (</w:t>
-      </w:r>
-      <w:proofErr w:type="spellStart"/>
-      <w:r>
-        <w:rPr>
-          <w:lang w:val="fr-FR"/>
-        </w:rPr>
-        <w:t>concat</w:t>
-      </w:r>
-      <w:proofErr w:type="spellEnd"/>
-      <w:r>
-        <w:rPr>
-          <w:lang w:val="fr-FR"/>
-        </w:rPr>
-        <w:t xml:space="preserve"> de client)</w:t>
+        <w:t>Champ notes lié à Résultat (concat de client)</w:t>
       </w:r>
       <w:r>
         <w:rPr>
@@ -1391,49 +1193,7 @@
         <w:rPr>
           <w:lang w:val="fr-FR"/>
         </w:rPr>
-        <w:t xml:space="preserve">ou les notes de client et questions sont </w:t>
-      </w:r>
-      <w:proofErr w:type="spellStart"/>
-      <w:r>
-        <w:rPr>
-          <w:lang w:val="fr-FR"/>
-        </w:rPr>
-        <w:t>concat</w:t>
-      </w:r>
-      <w:proofErr w:type="spellEnd"/>
-      <w:r>
-        <w:rPr>
-          <w:lang w:val="fr-FR"/>
-        </w:rPr>
-        <w:t xml:space="preserve"> mais </w:t>
-      </w:r>
-      <w:proofErr w:type="spellStart"/>
-      <w:r>
-        <w:rPr>
-          <w:lang w:val="fr-FR"/>
-        </w:rPr>
-        <w:t>ou</w:t>
-      </w:r>
-      <w:proofErr w:type="spellEnd"/>
-      <w:r>
-        <w:rPr>
-          <w:lang w:val="fr-FR"/>
-        </w:rPr>
-        <w:t xml:space="preserve"> il peut encore </w:t>
-      </w:r>
-      <w:proofErr w:type="spellStart"/>
-      <w:r>
-        <w:rPr>
-          <w:lang w:val="fr-FR"/>
-        </w:rPr>
-        <w:t>concat</w:t>
-      </w:r>
-      <w:proofErr w:type="spellEnd"/>
-      <w:r>
-        <w:rPr>
-          <w:lang w:val="fr-FR"/>
-        </w:rPr>
-        <w:t xml:space="preserve"> plus de texte.</w:t>
+        <w:t>ou les notes de client et questions sont concat mais ou il peut encore concat plus de texte.</w:t>
       </w:r>
     </w:p>
     <w:p>
@@ -1499,23 +1259,7 @@
         <w:rPr>
           <w:lang w:val="fr-FR"/>
         </w:rPr>
-        <w:t xml:space="preserve"> rempli (ou </w:t>
-      </w:r>
-      <w:proofErr w:type="spellStart"/>
-      <w:proofErr w:type="gramStart"/>
-      <w:r>
-        <w:rPr>
-          <w:lang w:val="fr-FR"/>
-        </w:rPr>
-        <w:t>est il</w:t>
-      </w:r>
-      <w:proofErr w:type="spellEnd"/>
-      <w:proofErr w:type="gramEnd"/>
-      <w:r>
-        <w:rPr>
-          <w:lang w:val="fr-FR"/>
-        </w:rPr>
-        <w:t xml:space="preserve"> stocké ?)</w:t>
+        <w:t xml:space="preserve"> rempli (ou est il stocké ?)</w:t>
       </w:r>
     </w:p>
     <w:p>

</xml_diff>